<commit_message>
post-review polish: soften 'strongest' / 'counter-publics' claims, fix 171 vs 172 numerator, add validation plan, inline numerators in headline table
</commit_message>
<xml_diff>
--- a/Codebooks/LLM Codebook/LLM Exploratory Analysis.docx
+++ b/Codebooks/LLM Codebook/LLM Exploratory Analysis.docx
@@ -297,7 +297,7 @@
                 <w:color w:val="141414"/>
                 <w:sz w:val="20"/>
               </w:rPr>
-              <w:t>Audience comments coded</w:t>
+              <w:t>Audience comments coded (n)</w:t>
             </w:r>
           </w:p>
         </w:tc>
@@ -387,7 +387,7 @@
                 <w:color w:val="141414"/>
                 <w:sz w:val="20"/>
               </w:rPr>
-              <w:t>Content snippets coded</w:t>
+              <w:t>Content snippets coded (n)</w:t>
             </w:r>
           </w:p>
         </w:tc>
@@ -478,7 +478,7 @@
                 <w:color w:val="141414"/>
                 <w:sz w:val="20"/>
               </w:rPr>
-              <w:t>Regressive share (content snippets)</w:t>
+              <w:t>Regressive share — % of country content snippets</w:t>
             </w:r>
           </w:p>
         </w:tc>
@@ -507,7 +507,7 @@
                 <w:color w:val="141414"/>
                 <w:sz w:val="20"/>
               </w:rPr>
-              <w:t>43%</w:t>
+              <w:t>43% (171 / 394)</w:t>
             </w:r>
           </w:p>
         </w:tc>
@@ -536,7 +536,7 @@
                 <w:color w:val="141414"/>
                 <w:sz w:val="20"/>
               </w:rPr>
-              <w:t>43%</w:t>
+              <w:t>43% (165 / 381)</w:t>
             </w:r>
           </w:p>
         </w:tc>
@@ -568,7 +568,7 @@
                 <w:color w:val="141414"/>
                 <w:sz w:val="20"/>
               </w:rPr>
-              <w:t>Progressive share (content snippets)</w:t>
+              <w:t>Progressive share — % of country content snippets</w:t>
             </w:r>
           </w:p>
         </w:tc>
@@ -598,7 +598,7 @@
                 <w:color w:val="141414"/>
                 <w:sz w:val="20"/>
               </w:rPr>
-              <w:t>35%</w:t>
+              <w:t>35% (138 / 394)</w:t>
             </w:r>
           </w:p>
         </w:tc>
@@ -628,7 +628,7 @@
                 <w:color w:val="141414"/>
                 <w:sz w:val="20"/>
               </w:rPr>
-              <w:t>31%</w:t>
+              <w:t>31% (117 / 381)</w:t>
             </w:r>
           </w:p>
         </w:tc>
@@ -659,7 +659,7 @@
                 <w:color w:val="141414"/>
                 <w:sz w:val="20"/>
               </w:rPr>
-              <w:t>Mixed / unclear (content snippets)</w:t>
+              <w:t>Mixed / unclear — % of country content snippets</w:t>
             </w:r>
           </w:p>
         </w:tc>
@@ -688,7 +688,7 @@
                 <w:color w:val="141414"/>
                 <w:sz w:val="20"/>
               </w:rPr>
-              <w:t>22%</w:t>
+              <w:t>22% (85 / 394)</w:t>
             </w:r>
           </w:p>
         </w:tc>
@@ -717,7 +717,7 @@
                 <w:color w:val="141414"/>
                 <w:sz w:val="20"/>
               </w:rPr>
-              <w:t>26%</w:t>
+              <w:t>26% (99 / 381)</w:t>
             </w:r>
           </w:p>
         </w:tc>
@@ -727,6 +727,21 @@
       <w:pPr>
         <w:spacing w:after="40"/>
       </w:pPr>
+    </w:p>
+    <w:p>
+      <w:pPr>
+        <w:spacing w:after="80" w:before="0"/>
+      </w:pPr>
+      <w:r>
+        <w:rPr>
+          <w:rFonts w:ascii="Arial" w:hAnsi="Arial" w:cs="Arial" w:eastAsia="Arial"/>
+          <w:b w:val="0"/>
+          <w:i/>
+          <w:color w:val="555555"/>
+          <w:sz w:val="20"/>
+        </w:rPr>
+        <w:t>Read every percentage in this document as "share within the curated Phase 1 sample". Because creators were selected to span both ends of the regressive ↔ progressive axis, the headline 43% / 35% / 31% figures reflect the composition of the corpus, not a population estimate for either country. Per-creator figures (Section 2) are the primary unit of analysis.</w:t>
+      </w:r>
     </w:p>
     <w:p>
       <w:pPr>
@@ -786,7 +801,7 @@
           <w:color w:val="141414"/>
           <w:sz w:val="21"/>
         </w:rPr>
-        <w:t>2.  Regressive content concentrates in a small set of creators. Kibe and Amerix together account for 157 of the 172 Kenyan regressive snippets (91%). In Nigeria, Agba John Doe, Shola, and Wizarab carry the bulk of regressive content; Banky Wellington, Deyemi Okanlawon, and Ebuka Obi-Uchendu code as progressive-leaning. Per-creator orientation is in Section 11.</w:t>
+        <w:t>2.  Regressive content concentrates in a small set of creators within this sample. Kibe and Amerix together account for 157 of the 171 Kenyan regressive snippets (92%). In Nigeria, Agba John Doe, Shola, and Wizarab carry the bulk of regressive content; Banky Wellington, Deyemi Okanlawon, and Ebuka Obi-Uchendu code as progressive-leaning. Per-creator orientation is in Section 11.</w:t>
       </w:r>
     </w:p>
     <w:p>
@@ -816,7 +831,7 @@
           <w:color w:val="141414"/>
           <w:sz w:val="21"/>
         </w:rPr>
-        <w:t>4.  Audience response patterns diverge by country. Kenyan audiences validate more than they push back (validation 155, resistance/pushback 100). Nigerian audiences invert that pattern (pushback 150, validation 113). The Nigerian comment threads in this sample are organised counter-publics rather than uniform echo chambers.</w:t>
+        <w:t>4.  Audience response patterns diverge by country in this sample. Kenyan audiences validate more than they push back (validation 155, resistance / pushback 100). Nigerian audiences invert that pattern (pushback 150, validation 113). The Nigerian comment threads in this sample appear closer to organised counter-publics than to uniform echo chambers; this is a sample-level observation and is not generalised beyond the curated set.</w:t>
       </w:r>
     </w:p>
     <w:p>
@@ -831,7 +846,7 @@
           <w:color w:val="141414"/>
           <w:sz w:val="21"/>
         </w:rPr>
-        <w:t>5.  Healing / testimony content carries the strongest counter-narrative signature in the sample. Under Rixpoet, audience comments code 88% supports and a high share of extends-the-message uptake. Banky Wellington shows the same pattern in Nigeria. This is the only register in the sample that produces both learning/reflection and personal disclosure at meaningful rates.</w:t>
+        <w:t>5.  Within this sample, the healing / testimony register appears to carry the clearest counter-narrative signature. Under Rixpoet, audience comments code 88% supports and a high share of extends-the-message uptake. Banky Wellington shows the same pattern in Nigeria. This is also the only register in the sample that produces both learning / reflection and personal disclosure at meaningful rates.</w:t>
       </w:r>
     </w:p>
     <w:p>
@@ -14067,7 +14082,7 @@
                 <w:color w:val="141414"/>
                 <w:sz w:val="20"/>
               </w:rPr>
-              <w:t>Nigeria: resistance / pushback (150) &gt; validation (113) &gt; learning / reflection (78). Nigerian threads in this sample are organised counter-publics rather than uniform echo chambers — a material consideration for playbook framing.</w:t>
+              <w:t>Nigeria: resistance / pushback (150) &gt; validation (113) &gt; learning / reflection (78). Nigerian threads in this sample appear closer to organised counter-publics than to uniform echo chambers — a sample-level observation, but one that matters for playbook framing.</w:t>
             </w:r>
           </w:p>
           <w:p>
@@ -17767,7 +17782,7 @@
           <w:color w:val="141414"/>
           <w:sz w:val="21"/>
         </w:rPr>
-        <w:t>Single-coder limitation. The LLM is the final coder. A human-coded recheck on a random sample is recommended for publication-grade reliability estimates; that work is scheduled in the focused pass.</w:t>
+        <w:t>Single-coder limitation and validation plan. The LLM is the final coder in this exploratory pass. A human-coded recheck on a stratified random sample (target: 10% of rows per country, balanced across high / medium / low confidence) is scheduled in the focused pass and will produce a per-variable agreement rate against the LLM codes. Inter-rater reliability between human reviewers (Cohen's κ on a shared subset) will be reported alongside. The exploratory figures in this document should be read as conditional on the LLM coding until the validation pass is complete.</w:t>
       </w:r>
     </w:p>
     <w:p>

</xml_diff>

<commit_message>
second review polish: 5+6 creator-count fix, rename sex% as any-sexism, soften validation + provider-narrative claims
</commit_message>
<xml_diff>
--- a/Codebooks/LLM Codebook/LLM Exploratory Analysis.docx
+++ b/Codebooks/LLM Codebook/LLM Exploratory Analysis.docx
@@ -1074,7 +1074,7 @@
           <w:color w:val="141414"/>
           <w:sz w:val="21"/>
         </w:rPr>
-        <w:t>Eleven masculinity-associated creators across Kenya and Nigeria, drawn from the manosphere-adjacent ecosystem identified in the landscape analysis. The sample sits within the Scope's 3–5-per-country guideline and 1,600-comment budget. Creators were chosen so that both ends of the regressive–progressive spectrum are visible in the data; this shapes how the corpus-level percentages should be read (see Section 25).</w:t>
+        <w:t>Eleven masculinity-associated creators across Kenya and Nigeria, drawn from the manosphere-adjacent ecosystem identified in the landscape analysis. Five Kenyan creators and six Nigerian creators were selected; this is at the upper end of the Scope's 3–5-per-country guideline, with Nigeria extended by one to capture the wider range of progressive and regressive voices in that ecosystem. The comment budget remains within the Scope's 1,600-comment envelope (1,604 coded rows total). Creators were chosen so that both ends of the regressive–progressive spectrum are visible in the data; this shapes how the corpus-level percentages should be read (see Section 25).</w:t>
       </w:r>
     </w:p>
     <w:tbl>
@@ -11947,7 +11947,7 @@
                 <w:color w:val="141414"/>
                 <w:sz w:val="20"/>
               </w:rPr>
-              <w:t>Narrative: "men are disadvantaged victims" / "men should dominate, lead". Topics: gender debate, dating / relationships. Frames: traditional gender order, male victimhood, female blame. Rhetoric: advice / instruction and commentary / opinion. Hostile-sexism rate: 41–74%.</w:t>
+              <w:t>Narrative: "men are disadvantaged victims" / "men should dominate, lead". Topics: gender debate, dating / relationships. Frames: traditional gender order, male victimhood, female blame. Rhetoric: advice / instruction and commentary / opinion. Sexism rate (any level — hostile, dehumanising, or benevolent / traditional): 41–74%.</w:t>
             </w:r>
           </w:p>
           <w:p>
@@ -12037,7 +12037,7 @@
                 <w:color w:val="141414"/>
                 <w:sz w:val="20"/>
               </w:rPr>
-              <w:t>Narrative: "men should provide and succeed" / "men should protect women and children". Topics: dating / relationships, money / status, marriage / family. Frames: traditional gender order, provider pressure, female blame. Rhetoric: commentary / opinion. Hostile-sexism rate: ~46%.</w:t>
+              <w:t>Narrative: "men should provide and succeed" / "men should protect women and children". Topics: dating / relationships, money / status, marriage / family. Frames: traditional gender order, provider pressure, female blame. Rhetoric: commentary / opinion. Sexism rate (any level — hostile, dehumanising, or benevolent / traditional): ~46%.</w:t>
             </w:r>
           </w:p>
           <w:p>
@@ -12127,7 +12127,7 @@
                 <w:color w:val="141414"/>
                 <w:sz w:val="20"/>
               </w:rPr>
-              <w:t>Narrative: "men should be emotionally open" / "men should improve themselves". Topics: mental health, fatherhood / parenting, gender debate. Frames: trauma healing, self-improvement, equality / partnership. Rhetoric: testimony, personal story, motivational speech. Hostile-sexism rate: ~0%.</w:t>
+              <w:t>Narrative: "men should be emotionally open" / "men should improve themselves". Topics: mental health, fatherhood / parenting, gender debate. Frames: trauma healing, self-improvement, equality / partnership. Rhetoric: testimony, personal story, motivational speech. Sexism rate (any level — hostile, dehumanising, or benevolent / traditional): ~0%.</w:t>
             </w:r>
           </w:p>
           <w:p>
@@ -12217,7 +12217,7 @@
                 <w:color w:val="141414"/>
                 <w:sz w:val="20"/>
               </w:rPr>
-              <w:t>Narrative: "men should be equal partners" / "men should protect women and children". Topics: marriage / family, fatherhood / parenting. Frames: equality / partnership, fatherhood responsibility. Rhetoric: commentary / opinion and advice / instruction. Hostile-sexism rate: ~3%.</w:t>
+              <w:t>Narrative: "men should be equal partners" / "men should protect women and children". Topics: marriage / family, fatherhood / parenting. Frames: equality / partnership, fatherhood responsibility. Rhetoric: commentary / opinion and advice / instruction. Sexism rate (any level — hostile, dehumanising, or benevolent / traditional): ~3%.</w:t>
             </w:r>
           </w:p>
           <w:p>
@@ -14634,7 +14634,7 @@
                 <w:color w:val="141414"/>
                 <w:sz w:val="20"/>
               </w:rPr>
-              <w:t>The most common Nigerian regressive narrative is "men should provide and succeed". The provider-pressure frame is real for adolescent boys and young men; direct attack is unlikely to land. The opening in the data is to decouple provider success from women's submission. Banky Wellington's content already does this; the playbook can scale that move.</w:t>
+              <w:t>The most common Nigerian regressive narrative in this sample is "men should provide and succeed". The provider-pressure frame is real for adolescent boys and young men, and the data suggest that directly contesting the narrative may be less effective than reframing it. The opening visible here is to decouple provider success from women's submission. Banky Wellington's content already does this; the playbook can scale that move.</w:t>
             </w:r>
           </w:p>
         </w:tc>
@@ -17782,7 +17782,7 @@
           <w:color w:val="141414"/>
           <w:sz w:val="21"/>
         </w:rPr>
-        <w:t>Single-coder limitation and validation plan. The LLM is the final coder in this exploratory pass. A human-coded recheck on a stratified random sample (target: 10% of rows per country, balanced across high / medium / low confidence) is scheduled in the focused pass and will produce a per-variable agreement rate against the LLM codes. Inter-rater reliability between human reviewers (Cohen's κ on a shared subset) will be reported alongside. The exploratory figures in this document should be read as conditional on the LLM coding until the validation pass is complete.</w:t>
+        <w:t>Single-coder limitation and proposed validation. The LLM is the final coder in this exploratory pass. For publication-grade reliability we recommend a human-coded recheck on a stratified random sample (suggested target: 10% of rows per country, balanced across high / medium / low confidence), producing a per-variable agreement rate against the LLM codes. Inter-rater reliability between human reviewers (Cohen's κ on a shared subset) can be reported alongside. Scope, timeline, and reviewer assignment for this validation pass are to be confirmed with the team; until it is complete, the exploratory figures in this document should be read as conditional on the LLM coding.</w:t>
       </w:r>
     </w:p>
     <w:p>

</xml_diff>